<commit_message>
Trim CV to 2 pages: tighter formatting, cut projects to 4, trim bullets and publications
Agent-Logs-Url: https://github.com/josephine-amponsah/josephine-amponsah/sessions/c1797291-812b-479a-8883-dab819fd15a9

Co-authored-by: josephine-amponsah <97001821+josephine-amponsah@users.noreply.github.com>
</commit_message>
<xml_diff>
--- a/Academic_CV_Josephine_Amponsah_Baah.docx
+++ b/Academic_CV_Josephine_Amponsah_Baah.docx
@@ -12,14 +12,14 @@
           <w:rFonts w:ascii="Calibri" w:hAnsi="Calibri"/>
           <w:b/>
           <w:i w:val="0"/>
-          <w:sz w:val="44"/>
+          <w:sz w:val="40"/>
         </w:rPr>
         <w:t>Josephine Amponsah Baah</w:t>
       </w:r>
     </w:p>
     <w:p>
       <w:pPr>
-        <w:spacing w:before="0" w:after="60"/>
+        <w:spacing w:before="0" w:after="40"/>
         <w:jc w:val="center"/>
       </w:pPr>
       <w:r>
@@ -28,14 +28,14 @@
           <w:b w:val="0"/>
           <w:i/>
           <w:color w:val="228B22"/>
-          <w:sz w:val="24"/>
+          <w:sz w:val="22"/>
         </w:rPr>
         <w:t>ML/AI Researcher</w:t>
       </w:r>
     </w:p>
     <w:p>
       <w:pPr>
-        <w:spacing w:before="0" w:after="120"/>
+        <w:spacing w:before="0" w:after="80"/>
         <w:jc w:val="center"/>
       </w:pPr>
       <w:r>
@@ -51,7 +51,7 @@
     </w:p>
     <w:p>
       <w:pPr>
-        <w:spacing w:before="200" w:after="40"/>
+        <w:spacing w:before="120" w:after="20"/>
         <w:pBdr>
           <w:bottom w:val="single" w:sz="6" w:space="1" w:color="228B22"/>
         </w:pBdr>
@@ -62,28 +62,28 @@
           <w:b/>
           <w:i w:val="0"/>
           <w:color w:val="228B22"/>
-          <w:sz w:val="22"/>
+          <w:sz w:val="21"/>
         </w:rPr>
         <w:t>RESEARCH INTERESTS</w:t>
       </w:r>
     </w:p>
     <w:p>
       <w:pPr>
-        <w:spacing w:before="60" w:after="80"/>
+        <w:spacing w:before="40" w:after="40"/>
       </w:pPr>
       <w:r>
         <w:rPr>
           <w:rFonts w:ascii="Calibri" w:hAnsi="Calibri"/>
           <w:b w:val="0"/>
           <w:i w:val="0"/>
-          <w:sz w:val="21"/>
+          <w:sz w:val="20"/>
         </w:rPr>
-        <w:t>My research interests lie at the intersection of Natural Language Processing, Large Language Models, and deep learning for sequence modelling and representation learning. I am particularly interested in studying the robustness and bias of NLI/NLU systems — examining how pre-trained transformers exploit spurious dataset artifacts and developing debiasing strategies that improve generalisation in high-stakes settings. Beyond core NLP, I am drawn to applications in Financial AI: leveraging statistical and machine learning methods for credit risk modelling and fraud detection, and exploring domain-adapted LLMs (FinBERT-style architectures) for intelligent financial document processing, validation, and compliance. I am actively seeking research opportunities that bridge robust natural language understanding with real-world financial and safety-critical applications.</w:t>
+        <w:t>My research focuses on NLP, deep learning, and LLM robustness — particularly bias mitigation in NLI/NLU systems — with applied interests in Financial AI including credit risk modelling, fraud detection, and domain-adapted LLMs (FinBERT) for financial document processing and validation.</w:t>
       </w:r>
     </w:p>
     <w:p>
       <w:pPr>
-        <w:spacing w:before="200" w:after="40"/>
+        <w:spacing w:before="120" w:after="20"/>
         <w:pBdr>
           <w:bottom w:val="single" w:sz="6" w:space="1" w:color="228B22"/>
         </w:pBdr>
@@ -94,14 +94,14 @@
           <w:b/>
           <w:i w:val="0"/>
           <w:color w:val="228B22"/>
-          <w:sz w:val="22"/>
+          <w:sz w:val="21"/>
         </w:rPr>
         <w:t>EDUCATION</w:t>
       </w:r>
     </w:p>
     <w:p>
       <w:pPr>
-        <w:spacing w:before="80" w:after="20"/>
+        <w:spacing w:before="60" w:after="20"/>
         <w:tabs>
           <w:tab w:val="right" w:pos="9360"/>
         </w:tabs>
@@ -111,7 +111,7 @@
           <w:rFonts w:ascii="Calibri" w:hAnsi="Calibri"/>
           <w:b/>
           <w:i w:val="0"/>
-          <w:sz w:val="21"/>
+          <w:sz w:val="20"/>
         </w:rPr>
         <w:t>MSc. Data Science  —  University of Texas, Austin, USA</w:t>
       </w:r>
@@ -121,10 +121,486 @@
           <w:b w:val="0"/>
           <w:i/>
           <w:color w:val="404040"/>
-          <w:sz w:val="21"/>
+          <w:sz w:val="20"/>
         </w:rPr>
         <w:tab/>
         <w:t>Aug 2024 – April 2026</w:t>
+      </w:r>
+    </w:p>
+    <w:p>
+      <w:pPr>
+        <w:spacing w:before="20" w:after="0"/>
+      </w:pPr>
+      <w:r>
+        <w:rPr>
+          <w:rFonts w:ascii="Calibri" w:hAnsi="Calibri"/>
+          <w:b/>
+          <w:i w:val="0"/>
+          <w:sz w:val="20"/>
+        </w:rPr>
+        <w:t xml:space="preserve">Relevant Courses: </w:t>
+      </w:r>
+      <w:r>
+        <w:rPr>
+          <w:rFonts w:ascii="Calibri" w:hAnsi="Calibri"/>
+          <w:b w:val="0"/>
+          <w:i w:val="0"/>
+          <w:sz w:val="20"/>
+        </w:rPr>
+        <w:t>Machine Learning, Data Structures &amp; Algorithms, Deep Learning, Advanced Predictive Modelling (Time-Series), Natural Language Processing, Advanced Deep Learning, Probability &amp; Statistics</w:t>
+      </w:r>
+    </w:p>
+    <w:p>
+      <w:pPr>
+        <w:spacing w:before="60" w:after="20"/>
+        <w:tabs>
+          <w:tab w:val="right" w:pos="9360"/>
+        </w:tabs>
+      </w:pPr>
+      <w:r>
+        <w:rPr>
+          <w:rFonts w:ascii="Calibri" w:hAnsi="Calibri"/>
+          <w:b/>
+          <w:i w:val="0"/>
+          <w:sz w:val="20"/>
+        </w:rPr>
+        <w:t>Azure Data Scientist Associate  —  Microsoft Certification</w:t>
+      </w:r>
+      <w:r>
+        <w:rPr>
+          <w:rFonts w:ascii="Calibri" w:hAnsi="Calibri"/>
+          <w:b w:val="0"/>
+          <w:i/>
+          <w:color w:val="404040"/>
+          <w:sz w:val="20"/>
+        </w:rPr>
+        <w:tab/>
+        <w:t>Sept 2023 – Sept 2026</w:t>
+      </w:r>
+    </w:p>
+    <w:p>
+      <w:pPr>
+        <w:spacing w:before="60" w:after="20"/>
+        <w:tabs>
+          <w:tab w:val="right" w:pos="9360"/>
+        </w:tabs>
+      </w:pPr>
+      <w:r>
+        <w:rPr>
+          <w:rFonts w:ascii="Calibri" w:hAnsi="Calibri"/>
+          <w:b/>
+          <w:i w:val="0"/>
+          <w:sz w:val="20"/>
+        </w:rPr>
+        <w:t>BSc. Engineering (Chemical)  —  Kwame Nkrumah University of Science &amp; Technology</w:t>
+      </w:r>
+      <w:r>
+        <w:rPr>
+          <w:rFonts w:ascii="Calibri" w:hAnsi="Calibri"/>
+          <w:b w:val="0"/>
+          <w:i/>
+          <w:color w:val="404040"/>
+          <w:sz w:val="20"/>
+        </w:rPr>
+        <w:tab/>
+        <w:t>Sept 2015 – July 2019</w:t>
+      </w:r>
+    </w:p>
+    <w:p>
+      <w:pPr>
+        <w:spacing w:before="120" w:after="20"/>
+        <w:pBdr>
+          <w:bottom w:val="single" w:sz="6" w:space="1" w:color="228B22"/>
+        </w:pBdr>
+      </w:pPr>
+      <w:r>
+        <w:rPr>
+          <w:rFonts w:ascii="Calibri" w:hAnsi="Calibri"/>
+          <w:b/>
+          <w:i w:val="0"/>
+          <w:color w:val="228B22"/>
+          <w:sz w:val="21"/>
+        </w:rPr>
+        <w:t>RESEARCH &amp; ACADEMIC PROJECTS</w:t>
+      </w:r>
+    </w:p>
+    <w:p>
+      <w:pPr>
+        <w:spacing w:before="60" w:after="0"/>
+      </w:pPr>
+      <w:r>
+        <w:rPr>
+          <w:rFonts w:ascii="Calibri" w:hAnsi="Calibri"/>
+          <w:b/>
+          <w:i w:val="0"/>
+          <w:sz w:val="20"/>
+        </w:rPr>
+        <w:t>Improving NLU via Ensemble Debiasing and Data Cartography</w:t>
+      </w:r>
+    </w:p>
+    <w:p>
+      <w:pPr>
+        <w:spacing w:before="0" w:after="0"/>
+      </w:pPr>
+      <w:r>
+        <w:rPr>
+          <w:rFonts w:ascii="Calibri" w:hAnsi="Calibri"/>
+          <w:b w:val="0"/>
+          <w:i/>
+          <w:color w:val="404040"/>
+          <w:sz w:val="19"/>
+        </w:rPr>
+        <w:t>NLP Final Paper  |  github.com/josephine-amponsah/multi-nli-nlu-optimization  |  Dec 2025</w:t>
+      </w:r>
+    </w:p>
+    <w:p>
+      <w:pPr>
+        <w:pStyle w:val="ListBullet"/>
+        <w:spacing w:before="0" w:after="0"/>
+        <w:ind w:left="360"/>
+      </w:pPr>
+      <w:r>
+        <w:rPr>
+          <w:rFonts w:ascii="Calibri" w:hAnsi="Calibri"/>
+          <w:b w:val="0"/>
+          <w:i w:val="0"/>
+          <w:sz w:val="20"/>
+        </w:rPr>
+        <w:t>Authored research paper investigating dataset artifacts in MultiNLI; fine-tuned ELECTRA-small and implemented ensemble debiasing and data cartography, achieving up to 4.6 pp robustness improvement on CheckList behavioral tests.</w:t>
+      </w:r>
+    </w:p>
+    <w:p>
+      <w:pPr>
+        <w:pStyle w:val="ListBullet"/>
+        <w:spacing w:before="0" w:after="0"/>
+        <w:ind w:left="360"/>
+      </w:pPr>
+      <w:r>
+        <w:rPr>
+          <w:rFonts w:ascii="Calibri" w:hAnsi="Calibri"/>
+          <w:b w:val="0"/>
+          <w:i w:val="0"/>
+          <w:sz w:val="20"/>
+        </w:rPr>
+        <w:t>Employed BiLSTM hypothesis-only baselines (InferSent, GloVe) alongside ELECTRA-small for controlled architecture comparison across negation, lexical overlap, and quantifier capabilities.</w:t>
+      </w:r>
+    </w:p>
+    <w:p>
+      <w:pPr>
+        <w:spacing w:before="60" w:after="0"/>
+      </w:pPr>
+      <w:r>
+        <w:rPr>
+          <w:rFonts w:ascii="Calibri" w:hAnsi="Calibri"/>
+          <w:b/>
+          <w:i w:val="0"/>
+          <w:sz w:val="20"/>
+        </w:rPr>
+        <w:t>Neural Network Classifier with Loss Optimisation</w:t>
+      </w:r>
+    </w:p>
+    <w:p>
+      <w:pPr>
+        <w:spacing w:before="0" w:after="0"/>
+      </w:pPr>
+      <w:r>
+        <w:rPr>
+          <w:rFonts w:ascii="Calibri" w:hAnsi="Calibri"/>
+          <w:b w:val="0"/>
+          <w:i/>
+          <w:color w:val="404040"/>
+          <w:sz w:val="19"/>
+        </w:rPr>
+        <w:t>Deep Learning  |  github.com/josephine-amponsah/nnclassifier-loss-optimization  |  Mar 2026</w:t>
+      </w:r>
+    </w:p>
+    <w:p>
+      <w:pPr>
+        <w:pStyle w:val="ListBullet"/>
+        <w:spacing w:before="0" w:after="0"/>
+        <w:ind w:left="360"/>
+      </w:pPr>
+      <w:r>
+        <w:rPr>
+          <w:rFonts w:ascii="Calibri" w:hAnsi="Calibri"/>
+          <w:b w:val="0"/>
+          <w:i w:val="0"/>
+          <w:sz w:val="20"/>
+        </w:rPr>
+        <w:t>Designed and trained deep classification networks (MLP, Deep Residual MLP) in PyTorch, implementing residual connections and softmax log-likelihood loss; achieved &gt;80% validation accuracy with TensorBoard-tracked training dynamics.</w:t>
+      </w:r>
+    </w:p>
+    <w:p>
+      <w:pPr>
+        <w:spacing w:before="60" w:after="0"/>
+      </w:pPr>
+      <w:r>
+        <w:rPr>
+          <w:rFonts w:ascii="Calibri" w:hAnsi="Calibri"/>
+          <w:b/>
+          <w:i w:val="0"/>
+          <w:sz w:val="20"/>
+        </w:rPr>
+        <w:t>NLP Transformer Models &amp; Sentiment Classifiers</w:t>
+      </w:r>
+    </w:p>
+    <w:p>
+      <w:pPr>
+        <w:spacing w:before="0" w:after="0"/>
+      </w:pPr>
+      <w:r>
+        <w:rPr>
+          <w:rFonts w:ascii="Calibri" w:hAnsi="Calibri"/>
+          <w:b w:val="0"/>
+          <w:i/>
+          <w:color w:val="404040"/>
+          <w:sz w:val="19"/>
+        </w:rPr>
+        <w:t>NLP  |  github.com/josephine-amponsah/nlp-transformer-models  |  Mar 2026</w:t>
+      </w:r>
+    </w:p>
+    <w:p>
+      <w:pPr>
+        <w:pStyle w:val="ListBullet"/>
+        <w:spacing w:before="0" w:after="0"/>
+        <w:ind w:left="360"/>
+      </w:pPr>
+      <w:r>
+        <w:rPr>
+          <w:rFonts w:ascii="Calibri" w:hAnsi="Calibri"/>
+          <w:b w:val="0"/>
+          <w:i w:val="0"/>
+          <w:sz w:val="20"/>
+        </w:rPr>
+        <w:t>Fine-tuned BERT/ELECTRA transformer models for sequence classification; built neural sentiment classifiers with custom optimization pipelines and investigated preprocessing strategies across multiple architectures.</w:t>
+      </w:r>
+    </w:p>
+    <w:p>
+      <w:pPr>
+        <w:spacing w:before="60" w:after="0"/>
+      </w:pPr>
+      <w:r>
+        <w:rPr>
+          <w:rFonts w:ascii="Calibri" w:hAnsi="Calibri"/>
+          <w:b/>
+          <w:i w:val="0"/>
+          <w:sz w:val="20"/>
+        </w:rPr>
+        <w:t>LLM Fact-Checking Pipeline &amp; ABSA Recommender</w:t>
+      </w:r>
+    </w:p>
+    <w:p>
+      <w:pPr>
+        <w:spacing w:before="0" w:after="0"/>
+      </w:pPr>
+      <w:r>
+        <w:rPr>
+          <w:rFonts w:ascii="Calibri" w:hAnsi="Calibri"/>
+          <w:b w:val="0"/>
+          <w:i/>
+          <w:color w:val="404040"/>
+          <w:sz w:val="19"/>
+        </w:rPr>
+        <w:t>NLP  |  github.com/josephine-amponsah/factchecking-llm-responses  |  github.com/josephine-amponsah/absa-based-recommender  |  Mar 2026</w:t>
+      </w:r>
+    </w:p>
+    <w:p>
+      <w:pPr>
+        <w:pStyle w:val="ListBullet"/>
+        <w:spacing w:before="0" w:after="0"/>
+        <w:ind w:left="360"/>
+      </w:pPr>
+      <w:r>
+        <w:rPr>
+          <w:rFonts w:ascii="Calibri" w:hAnsi="Calibri"/>
+          <w:b w:val="0"/>
+          <w:i w:val="0"/>
+          <w:sz w:val="20"/>
+        </w:rPr>
+        <w:t>Developed an LLM fact-checking pipeline for response validation; built BERT-based aspect sentiment analysis model (Word2vec + ABSA) for fine-grained customer sentiment extraction, applied in financial document and recommender contexts.</w:t>
+      </w:r>
+    </w:p>
+    <w:p>
+      <w:pPr>
+        <w:spacing w:before="120" w:after="20"/>
+        <w:pBdr>
+          <w:bottom w:val="single" w:sz="6" w:space="1" w:color="228B22"/>
+        </w:pBdr>
+      </w:pPr>
+      <w:r>
+        <w:rPr>
+          <w:rFonts w:ascii="Calibri" w:hAnsi="Calibri"/>
+          <w:b/>
+          <w:i w:val="0"/>
+          <w:color w:val="228B22"/>
+          <w:sz w:val="21"/>
+        </w:rPr>
+        <w:t>EXPERIENCE</w:t>
+      </w:r>
+    </w:p>
+    <w:p>
+      <w:pPr>
+        <w:spacing w:before="60" w:after="20"/>
+        <w:tabs>
+          <w:tab w:val="right" w:pos="9360"/>
+        </w:tabs>
+      </w:pPr>
+      <w:r>
+        <w:rPr>
+          <w:rFonts w:ascii="Calibri" w:hAnsi="Calibri"/>
+          <w:b/>
+          <w:i w:val="0"/>
+          <w:sz w:val="20"/>
+        </w:rPr>
+        <w:t>Data Analyst  —  Fido Microcredit (FinTech)</w:t>
+      </w:r>
+      <w:r>
+        <w:rPr>
+          <w:rFonts w:ascii="Calibri" w:hAnsi="Calibri"/>
+          <w:b w:val="0"/>
+          <w:i/>
+          <w:color w:val="404040"/>
+          <w:sz w:val="20"/>
+        </w:rPr>
+        <w:tab/>
+        <w:t>July 2024 – Present</w:t>
+      </w:r>
+    </w:p>
+    <w:p>
+      <w:pPr>
+        <w:spacing w:before="20" w:after="0"/>
+      </w:pPr>
+      <w:r>
+        <w:rPr>
+          <w:rFonts w:ascii="Calibri" w:hAnsi="Calibri"/>
+          <w:b w:val="0"/>
+          <w:i/>
+          <w:color w:val="404040"/>
+          <w:sz w:val="20"/>
+        </w:rPr>
+        <w:t>Statistical Analysis &amp; ML Research</w:t>
+      </w:r>
+    </w:p>
+    <w:p>
+      <w:pPr>
+        <w:pStyle w:val="ListBullet"/>
+        <w:spacing w:before="0" w:after="0"/>
+        <w:ind w:left="360"/>
+      </w:pPr>
+      <w:r>
+        <w:rPr>
+          <w:rFonts w:ascii="Calibri" w:hAnsi="Calibri"/>
+          <w:b w:val="0"/>
+          <w:i w:val="0"/>
+          <w:sz w:val="20"/>
+        </w:rPr>
+        <w:t>Optimized statistical models behind fraud monitoring logics using central tendency measures and feature engineering techniques, reducing false fraud flags by 28%.</w:t>
+      </w:r>
+    </w:p>
+    <w:p>
+      <w:pPr>
+        <w:pStyle w:val="ListBullet"/>
+        <w:spacing w:before="0" w:after="0"/>
+        <w:ind w:left="360"/>
+      </w:pPr>
+      <w:r>
+        <w:rPr>
+          <w:rFonts w:ascii="Calibri" w:hAnsi="Calibri"/>
+          <w:b w:val="0"/>
+          <w:i w:val="0"/>
+          <w:sz w:val="20"/>
+        </w:rPr>
+        <w:t>Built a supervised learning model to automate flagging of newly discovered fraud patterns, replacing blanket geohash blocking at precision level 5.</w:t>
+      </w:r>
+    </w:p>
+    <w:p>
+      <w:pPr>
+        <w:pStyle w:val="ListBullet"/>
+        <w:spacing w:before="0" w:after="0"/>
+        <w:ind w:left="360"/>
+      </w:pPr>
+      <w:r>
+        <w:rPr>
+          <w:rFonts w:ascii="Calibri" w:hAnsi="Calibri"/>
+          <w:b w:val="0"/>
+          <w:i w:val="0"/>
+          <w:sz w:val="20"/>
+        </w:rPr>
+        <w:t>Analysed impact of new KYC requirements on risk performance via A/B testing cohort analysis; contributed features to new versions of risk behavioural models.</w:t>
+      </w:r>
+    </w:p>
+    <w:p>
+      <w:pPr>
+        <w:spacing w:before="60" w:after="20"/>
+        <w:tabs>
+          <w:tab w:val="right" w:pos="9360"/>
+        </w:tabs>
+      </w:pPr>
+      <w:r>
+        <w:rPr>
+          <w:rFonts w:ascii="Calibri" w:hAnsi="Calibri"/>
+          <w:b/>
+          <w:i w:val="0"/>
+          <w:sz w:val="20"/>
+        </w:rPr>
+        <w:t>Data Analyst  —  WeTheBrands (E-Commerce), Germany</w:t>
+      </w:r>
+      <w:r>
+        <w:rPr>
+          <w:rFonts w:ascii="Calibri" w:hAnsi="Calibri"/>
+          <w:b w:val="0"/>
+          <w:i/>
+          <w:color w:val="404040"/>
+          <w:sz w:val="20"/>
+        </w:rPr>
+        <w:tab/>
+        <w:t>Jan 2024 – Nov 2024</w:t>
+      </w:r>
+    </w:p>
+    <w:p>
+      <w:pPr>
+        <w:spacing w:before="60" w:after="20"/>
+        <w:tabs>
+          <w:tab w:val="right" w:pos="9360"/>
+        </w:tabs>
+      </w:pPr>
+      <w:r>
+        <w:rPr>
+          <w:rFonts w:ascii="Calibri" w:hAnsi="Calibri"/>
+          <w:b/>
+          <w:i w:val="0"/>
+          <w:sz w:val="20"/>
+        </w:rPr>
+        <w:t>Data Analyst  —  Broadspectrum Digital Payments (FinTech)</w:t>
+      </w:r>
+      <w:r>
+        <w:rPr>
+          <w:rFonts w:ascii="Calibri" w:hAnsi="Calibri"/>
+          <w:b w:val="0"/>
+          <w:i/>
+          <w:color w:val="404040"/>
+          <w:sz w:val="20"/>
+        </w:rPr>
+        <w:tab/>
+        <w:t>Jan 2022 – Jan 2024</w:t>
+      </w:r>
+    </w:p>
+    <w:p>
+      <w:pPr>
+        <w:spacing w:before="120" w:after="20"/>
+        <w:pBdr>
+          <w:bottom w:val="single" w:sz="6" w:space="1" w:color="228B22"/>
+        </w:pBdr>
+      </w:pPr>
+      <w:r>
+        <w:rPr>
+          <w:rFonts w:ascii="Calibri" w:hAnsi="Calibri"/>
+          <w:b/>
+          <w:i w:val="0"/>
+          <w:color w:val="228B22"/>
+          <w:sz w:val="21"/>
+        </w:rPr>
+        <w:t>SKILLS</w:t>
       </w:r>
     </w:p>
     <w:p>
@@ -136,125 +612,69 @@
           <w:rFonts w:ascii="Calibri" w:hAnsi="Calibri"/>
           <w:b/>
           <w:i w:val="0"/>
-          <w:sz w:val="21"/>
+          <w:sz w:val="20"/>
         </w:rPr>
-        <w:t xml:space="preserve">Relevant Courses: </w:t>
+        <w:t xml:space="preserve">Domains: </w:t>
       </w:r>
       <w:r>
         <w:rPr>
           <w:rFonts w:ascii="Calibri" w:hAnsi="Calibri"/>
           <w:b w:val="0"/>
           <w:i w:val="0"/>
-          <w:sz w:val="21"/>
+          <w:sz w:val="20"/>
         </w:rPr>
-        <w:t>Machine Learning, Data Structures &amp; Algorithms, Deep Learning, Advanced Predictive Modelling (Time-Series), Natural Language Processing, Advanced Deep Learning, Probability &amp; Statistics</w:t>
+        <w:t>Supervised Learning, Unsupervised Learning, NLP &amp; Transformers, Deep Learning, Statistical Analysis, Forecasting, Financial Risk Modelling, Data Visualisation, Recommender Systems</w:t>
       </w:r>
     </w:p>
     <w:p>
       <w:pPr>
-        <w:spacing w:before="40" w:after="20"/>
+        <w:spacing w:before="20" w:after="20"/>
       </w:pPr>
       <w:r>
         <w:rPr>
           <w:rFonts w:ascii="Calibri" w:hAnsi="Calibri"/>
           <w:b/>
           <w:i w:val="0"/>
-          <w:sz w:val="21"/>
+          <w:sz w:val="20"/>
         </w:rPr>
-        <w:t>Relevant Projects (from coursework):</w:t>
+        <w:t xml:space="preserve">Frameworks/Tools: </w:t>
       </w:r>
-    </w:p>
-    <w:p>
-      <w:pPr>
-        <w:pStyle w:val="ListBullet"/>
-        <w:spacing w:before="20" w:after="20"/>
-        <w:ind w:left="360"/>
-      </w:pPr>
       <w:r>
         <w:rPr>
           <w:rFonts w:ascii="Calibri" w:hAnsi="Calibri"/>
           <w:b w:val="0"/>
           <w:i w:val="0"/>
-          <w:sz w:val="21"/>
+          <w:sz w:val="20"/>
         </w:rPr>
-        <w:t>Optimized natural language understanding of BERT models with ensemble debiasing and data cartography (NLP Final Project)</w:t>
+        <w:t>PyTorch, TensorFlow/Keras, HuggingFace Transformers, Pandas, NumPy, Matplotlib, Scikit-learn, NLTK, Gensim, FastAPI, Flask, Docker, BigQuery, DBT, PowerBI, Tableau, GitHub</w:t>
       </w:r>
     </w:p>
     <w:p>
       <w:pPr>
-        <w:pStyle w:val="ListBullet"/>
         <w:spacing w:before="20" w:after="20"/>
-        <w:ind w:left="360"/>
-      </w:pPr>
-      <w:r>
-        <w:rPr>
-          <w:rFonts w:ascii="Calibri" w:hAnsi="Calibri"/>
-          <w:b w:val="0"/>
-          <w:i w:val="0"/>
-          <w:sz w:val="21"/>
-        </w:rPr>
-        <w:t>Built and trained deep learning models to optimise training loss using MLP, deep residual networks and CNN architectures (Deep Learning)</w:t>
-      </w:r>
-    </w:p>
-    <w:p>
-      <w:pPr>
-        <w:spacing w:before="80" w:after="20"/>
-        <w:tabs>
-          <w:tab w:val="right" w:pos="9360"/>
-        </w:tabs>
       </w:pPr>
       <w:r>
         <w:rPr>
           <w:rFonts w:ascii="Calibri" w:hAnsi="Calibri"/>
           <w:b/>
           <w:i w:val="0"/>
-          <w:sz w:val="21"/>
+          <w:sz w:val="20"/>
         </w:rPr>
-        <w:t>Azure Data Scientist Associate  —  Microsoft Certification</w:t>
+        <w:t xml:space="preserve">Languages: </w:t>
       </w:r>
       <w:r>
         <w:rPr>
           <w:rFonts w:ascii="Calibri" w:hAnsi="Calibri"/>
           <w:b w:val="0"/>
-          <w:i/>
-          <w:color w:val="404040"/>
-          <w:sz w:val="21"/>
+          <w:i w:val="0"/>
+          <w:sz w:val="20"/>
         </w:rPr>
-        <w:tab/>
-        <w:t>Sept 2023 – Sept 2026</w:t>
+        <w:t>Python, R, SQL, DAX, Azure, AWS</w:t>
       </w:r>
     </w:p>
     <w:p>
       <w:pPr>
-        <w:spacing w:before="80" w:after="20"/>
-        <w:tabs>
-          <w:tab w:val="right" w:pos="9360"/>
-        </w:tabs>
-      </w:pPr>
-      <w:r>
-        <w:rPr>
-          <w:rFonts w:ascii="Calibri" w:hAnsi="Calibri"/>
-          <w:b/>
-          <w:i w:val="0"/>
-          <w:sz w:val="21"/>
-        </w:rPr>
-        <w:t>BSc. Engineering (Chemical)  —  Kwame Nkrumah University of Science &amp; Technology</w:t>
-      </w:r>
-      <w:r>
-        <w:rPr>
-          <w:rFonts w:ascii="Calibri" w:hAnsi="Calibri"/>
-          <w:b w:val="0"/>
-          <w:i/>
-          <w:color w:val="404040"/>
-          <w:sz w:val="21"/>
-        </w:rPr>
-        <w:tab/>
-        <w:t>Sept 2015 – July 2019</w:t>
-      </w:r>
-    </w:p>
-    <w:p>
-      <w:pPr>
-        <w:spacing w:before="200" w:after="40"/>
+        <w:spacing w:before="120" w:after="20"/>
         <w:pBdr>
           <w:bottom w:val="single" w:sz="6" w:space="1" w:color="228B22"/>
         </w:pBdr>
@@ -265,837 +685,44 @@
           <w:b/>
           <w:i w:val="0"/>
           <w:color w:val="228B22"/>
-          <w:sz w:val="22"/>
+          <w:sz w:val="21"/>
         </w:rPr>
-        <w:t>RESEARCH &amp; ACADEMIC PROJECTS</w:t>
+        <w:t>PUBLICATIONS &amp; PRESENTATIONS</w:t>
       </w:r>
     </w:p>
     <w:p>
       <w:pPr>
-        <w:spacing w:before="100" w:after="20"/>
+        <w:spacing w:before="20" w:after="20"/>
       </w:pPr>
       <w:r>
         <w:rPr>
           <w:rFonts w:ascii="Calibri" w:hAnsi="Calibri"/>
           <w:b/>
           <w:i w:val="0"/>
-          <w:sz w:val="21"/>
+          <w:sz w:val="20"/>
         </w:rPr>
         <w:t>Improving Natural Language Understanding via Ensemble Debiasing and Data Cartography</w:t>
       </w:r>
-    </w:p>
-    <w:p>
-      <w:pPr>
-        <w:spacing w:before="0" w:after="20"/>
-      </w:pPr>
-      <w:r>
-        <w:rPr>
-          <w:rFonts w:ascii="Calibri" w:hAnsi="Calibri"/>
-          <w:b w:val="0"/>
-          <w:i/>
-          <w:color w:val="404040"/>
-          <w:sz w:val="20"/>
-        </w:rPr>
-        <w:t>NLP Final Paper  |  github.com/josephine-amponsah/multi-nli-nlu-optimization  |  Dec 2025</w:t>
-      </w:r>
-    </w:p>
-    <w:p>
-      <w:pPr>
-        <w:pStyle w:val="ListBullet"/>
-        <w:spacing w:before="20" w:after="20"/>
-        <w:ind w:left="360"/>
-      </w:pPr>
       <w:r>
         <w:rPr>
           <w:rFonts w:ascii="Calibri" w:hAnsi="Calibri"/>
           <w:b w:val="0"/>
           <w:i w:val="0"/>
-          <w:sz w:val="21"/>
+          <w:sz w:val="20"/>
         </w:rPr>
-        <w:t>Authored research paper investigating dataset artifacts and spurious correlations in MultiNLI, fine-tuning ELECTRA-small with full premise-hypothesis pairs and hypothesis-only baselines</w:t>
+        <w:t xml:space="preserve"> — NLP Final Paper, UT Austin, 2025. github.com/josephine-amponsah/multi-nli-nlu-optimization</w:t>
       </w:r>
     </w:p>
     <w:p>
       <w:pPr>
-        <w:pStyle w:val="ListBullet"/>
         <w:spacing w:before="20" w:after="20"/>
-        <w:ind w:left="360"/>
-      </w:pPr>
-      <w:r>
-        <w:rPr>
-          <w:rFonts w:ascii="Calibri" w:hAnsi="Calibri"/>
-          <w:b w:val="0"/>
-          <w:i w:val="0"/>
-          <w:sz w:val="21"/>
-        </w:rPr>
-        <w:t>Implemented and evaluated ensemble debiasing and dataset cartography as debiasing strategies, achieving up to 4.6 percentage point improvement in robustness on CheckList behavioral tests</w:t>
-      </w:r>
-    </w:p>
-    <w:p>
-      <w:pPr>
-        <w:pStyle w:val="ListBullet"/>
-        <w:spacing w:before="20" w:after="20"/>
-        <w:ind w:left="360"/>
-      </w:pPr>
-      <w:r>
-        <w:rPr>
-          <w:rFonts w:ascii="Calibri" w:hAnsi="Calibri"/>
-          <w:b w:val="0"/>
-          <w:i w:val="0"/>
-          <w:sz w:val="21"/>
-        </w:rPr>
-        <w:t>Employed BiLSTM hypothesis-only baselines (InferSent methodology, GloVe embeddings) alongside transformer-based ELECTRA-small models for controlled architecture comparison</w:t>
-      </w:r>
-    </w:p>
-    <w:p>
-      <w:pPr>
-        <w:pStyle w:val="ListBullet"/>
-        <w:spacing w:before="20" w:after="20"/>
-        <w:ind w:left="360"/>
-      </w:pPr>
-      <w:r>
-        <w:rPr>
-          <w:rFonts w:ascii="Calibri" w:hAnsi="Calibri"/>
-          <w:b w:val="0"/>
-          <w:i w:val="0"/>
-          <w:sz w:val="21"/>
-        </w:rPr>
-        <w:t>Used CheckList behavioral testing framework to evaluate linguistic capabilities including negation, lexical overlap, quantifiers, and world knowledge beyond held-out accuracy</w:t>
-      </w:r>
-    </w:p>
-    <w:p>
-      <w:pPr>
-        <w:spacing w:before="100" w:after="20"/>
       </w:pPr>
       <w:r>
         <w:rPr>
           <w:rFonts w:ascii="Calibri" w:hAnsi="Calibri"/>
           <w:b/>
           <w:i w:val="0"/>
-          <w:sz w:val="21"/>
-        </w:rPr>
-        <w:t>Neural Network Classifier with Loss Optimisation</w:t>
-      </w:r>
-    </w:p>
-    <w:p>
-      <w:pPr>
-        <w:spacing w:before="0" w:after="20"/>
-      </w:pPr>
-      <w:r>
-        <w:rPr>
-          <w:rFonts w:ascii="Calibri" w:hAnsi="Calibri"/>
-          <w:b w:val="0"/>
-          <w:i/>
-          <w:color w:val="404040"/>
           <w:sz w:val="20"/>
-        </w:rPr>
-        <w:t>Deep Learning  |  github.com/josephine-amponsah/nnclassifier-loss-optimization  |  Mar 2026</w:t>
-      </w:r>
-    </w:p>
-    <w:p>
-      <w:pPr>
-        <w:pStyle w:val="ListBullet"/>
-        <w:spacing w:before="20" w:after="20"/>
-        <w:ind w:left="360"/>
-      </w:pPr>
-      <w:r>
-        <w:rPr>
-          <w:rFonts w:ascii="Calibri" w:hAnsi="Calibri"/>
-          <w:b w:val="0"/>
-          <w:i w:val="0"/>
-          <w:sz w:val="21"/>
-        </w:rPr>
-        <w:t>Designed and trained deep classification networks (Linear, MLP, Deep MLP, Deep Residual MLP) on image classification tasks using PyTorch</w:t>
-      </w:r>
-    </w:p>
-    <w:p>
-      <w:pPr>
-        <w:pStyle w:val="ListBullet"/>
-        <w:spacing w:before="20" w:after="20"/>
-        <w:ind w:left="360"/>
-      </w:pPr>
-      <w:r>
-        <w:rPr>
-          <w:rFonts w:ascii="Calibri" w:hAnsi="Calibri"/>
-          <w:b w:val="0"/>
-          <w:i w:val="0"/>
-          <w:sz w:val="21"/>
-        </w:rPr>
-        <w:t>Implemented residual connections to mitigate vanishing gradient problems in networks with 4+ layers, achieving &gt;80% validation accuracy</w:t>
-      </w:r>
-    </w:p>
-    <w:p>
-      <w:pPr>
-        <w:pStyle w:val="ListBullet"/>
-        <w:spacing w:before="20" w:after="20"/>
-        <w:ind w:left="360"/>
-      </w:pPr>
-      <w:r>
-        <w:rPr>
-          <w:rFonts w:ascii="Calibri" w:hAnsi="Calibri"/>
-          <w:b w:val="0"/>
-          <w:i w:val="0"/>
-          <w:sz w:val="21"/>
-        </w:rPr>
-        <w:t>Experimented with classification loss functions (softmax log-likelihood), learning rate scheduling, and hyperparameter tuning (batch size, hidden dimension, number of layers)</w:t>
-      </w:r>
-    </w:p>
-    <w:p>
-      <w:pPr>
-        <w:pStyle w:val="ListBullet"/>
-        <w:spacing w:before="20" w:after="20"/>
-        <w:ind w:left="360"/>
-      </w:pPr>
-      <w:r>
-        <w:rPr>
-          <w:rFonts w:ascii="Calibri" w:hAnsi="Calibri"/>
-          <w:b w:val="0"/>
-          <w:i w:val="0"/>
-          <w:sz w:val="21"/>
-        </w:rPr>
-        <w:t>Logged training dynamics with TensorBoard to monitor loss and accuracy across epochs</w:t>
-      </w:r>
-    </w:p>
-    <w:p>
-      <w:pPr>
-        <w:spacing w:before="100" w:after="20"/>
-      </w:pPr>
-      <w:r>
-        <w:rPr>
-          <w:rFonts w:ascii="Calibri" w:hAnsi="Calibri"/>
-          <w:b/>
-          <w:i w:val="0"/>
-          <w:sz w:val="21"/>
-        </w:rPr>
-        <w:t>Transformer-Based NLP Models</w:t>
-      </w:r>
-    </w:p>
-    <w:p>
-      <w:pPr>
-        <w:spacing w:before="0" w:after="20"/>
-      </w:pPr>
-      <w:r>
-        <w:rPr>
-          <w:rFonts w:ascii="Calibri" w:hAnsi="Calibri"/>
-          <w:b w:val="0"/>
-          <w:i/>
-          <w:color w:val="404040"/>
-          <w:sz w:val="20"/>
-        </w:rPr>
-        <w:t>NLP  |  github.com/josephine-amponsah/nlp-transformer-models  |  Mar 2026</w:t>
-      </w:r>
-    </w:p>
-    <w:p>
-      <w:pPr>
-        <w:pStyle w:val="ListBullet"/>
-        <w:spacing w:before="20" w:after="20"/>
-        <w:ind w:left="360"/>
-      </w:pPr>
-      <w:r>
-        <w:rPr>
-          <w:rFonts w:ascii="Calibri" w:hAnsi="Calibri"/>
-          <w:b w:val="0"/>
-          <w:i w:val="0"/>
-          <w:sz w:val="21"/>
-        </w:rPr>
-        <w:t>Implemented and fine-tuned transformer architectures (BERT, ELECTRA) for downstream NLP classification tasks</w:t>
-      </w:r>
-    </w:p>
-    <w:p>
-      <w:pPr>
-        <w:pStyle w:val="ListBullet"/>
-        <w:spacing w:before="20" w:after="20"/>
-        <w:ind w:left="360"/>
-      </w:pPr>
-      <w:r>
-        <w:rPr>
-          <w:rFonts w:ascii="Calibri" w:hAnsi="Calibri"/>
-          <w:b w:val="0"/>
-          <w:i w:val="0"/>
-          <w:sz w:val="21"/>
-        </w:rPr>
-        <w:t>Explored attention mechanisms, tokenization strategies, and fine-tuning best practices on sequence classification benchmarks</w:t>
-      </w:r>
-    </w:p>
-    <w:p>
-      <w:pPr>
-        <w:spacing w:before="100" w:after="20"/>
-      </w:pPr>
-      <w:r>
-        <w:rPr>
-          <w:rFonts w:ascii="Calibri" w:hAnsi="Calibri"/>
-          <w:b/>
-          <w:i w:val="0"/>
-          <w:sz w:val="21"/>
-        </w:rPr>
-        <w:t>Neural Network Sentiment Classifier</w:t>
-      </w:r>
-    </w:p>
-    <w:p>
-      <w:pPr>
-        <w:spacing w:before="0" w:after="20"/>
-      </w:pPr>
-      <w:r>
-        <w:rPr>
-          <w:rFonts w:ascii="Calibri" w:hAnsi="Calibri"/>
-          <w:b w:val="0"/>
-          <w:i/>
-          <w:color w:val="404040"/>
-          <w:sz w:val="20"/>
-        </w:rPr>
-        <w:t>NLP  |  github.com/josephine-amponsah/neural-network-sentiment-classifier  |  Mar 2026</w:t>
-      </w:r>
-    </w:p>
-    <w:p>
-      <w:pPr>
-        <w:pStyle w:val="ListBullet"/>
-        <w:spacing w:before="20" w:after="20"/>
-        <w:ind w:left="360"/>
-      </w:pPr>
-      <w:r>
-        <w:rPr>
-          <w:rFonts w:ascii="Calibri" w:hAnsi="Calibri"/>
-          <w:b w:val="0"/>
-          <w:i w:val="0"/>
-          <w:sz w:val="21"/>
-        </w:rPr>
-        <w:t>Built neural sentiment classification models with optimised architectures (RNNs, feedforward networks) for fine-grained sentiment analysis</w:t>
-      </w:r>
-    </w:p>
-    <w:p>
-      <w:pPr>
-        <w:pStyle w:val="ListBullet"/>
-        <w:spacing w:before="20" w:after="20"/>
-        <w:ind w:left="360"/>
-      </w:pPr>
-      <w:r>
-        <w:rPr>
-          <w:rFonts w:ascii="Calibri" w:hAnsi="Calibri"/>
-          <w:b w:val="0"/>
-          <w:i w:val="0"/>
-          <w:sz w:val="21"/>
-        </w:rPr>
-        <w:t>Implemented custom optimization routines and model evaluation pipelines with per-class precision, recall, and F1 metrics</w:t>
-      </w:r>
-    </w:p>
-    <w:p>
-      <w:pPr>
-        <w:spacing w:before="100" w:after="20"/>
-      </w:pPr>
-      <w:r>
-        <w:rPr>
-          <w:rFonts w:ascii="Calibri" w:hAnsi="Calibri"/>
-          <w:b/>
-          <w:i w:val="0"/>
-          <w:sz w:val="21"/>
-        </w:rPr>
-        <w:t>Natural Language Preprocessing Optimisation</w:t>
-      </w:r>
-    </w:p>
-    <w:p>
-      <w:pPr>
-        <w:spacing w:before="0" w:after="20"/>
-      </w:pPr>
-      <w:r>
-        <w:rPr>
-          <w:rFonts w:ascii="Calibri" w:hAnsi="Calibri"/>
-          <w:b w:val="0"/>
-          <w:i/>
-          <w:color w:val="404040"/>
-          <w:sz w:val="20"/>
-        </w:rPr>
-        <w:t>NLP  |  github.com/josephine-amponsah/nl-preprocessing-optimization  |  Mar 2026</w:t>
-      </w:r>
-    </w:p>
-    <w:p>
-      <w:pPr>
-        <w:pStyle w:val="ListBullet"/>
-        <w:spacing w:before="20" w:after="20"/>
-        <w:ind w:left="360"/>
-      </w:pPr>
-      <w:r>
-        <w:rPr>
-          <w:rFonts w:ascii="Calibri" w:hAnsi="Calibri"/>
-          <w:b w:val="0"/>
-          <w:i w:val="0"/>
-          <w:sz w:val="21"/>
-        </w:rPr>
-        <w:t>Investigated the impact of different preprocessing strategies on downstream sentiment classification performance</w:t>
-      </w:r>
-    </w:p>
-    <w:p>
-      <w:pPr>
-        <w:pStyle w:val="ListBullet"/>
-        <w:spacing w:before="20" w:after="20"/>
-        <w:ind w:left="360"/>
-      </w:pPr>
-      <w:r>
-        <w:rPr>
-          <w:rFonts w:ascii="Calibri" w:hAnsi="Calibri"/>
-          <w:b w:val="0"/>
-          <w:i w:val="0"/>
-          <w:sz w:val="21"/>
-        </w:rPr>
-        <w:t>Compared tokenization schemes and preprocessing pipelines across multiple model architectures</w:t>
-      </w:r>
-    </w:p>
-    <w:p>
-      <w:pPr>
-        <w:spacing w:before="100" w:after="20"/>
-      </w:pPr>
-      <w:r>
-        <w:rPr>
-          <w:rFonts w:ascii="Calibri" w:hAnsi="Calibri"/>
-          <w:b/>
-          <w:i w:val="0"/>
-          <w:sz w:val="21"/>
-        </w:rPr>
-        <w:t>LLM Fact-Checking Pipeline</w:t>
-      </w:r>
-    </w:p>
-    <w:p>
-      <w:pPr>
-        <w:spacing w:before="0" w:after="20"/>
-      </w:pPr>
-      <w:r>
-        <w:rPr>
-          <w:rFonts w:ascii="Calibri" w:hAnsi="Calibri"/>
-          <w:b w:val="0"/>
-          <w:i/>
-          <w:color w:val="404040"/>
-          <w:sz w:val="20"/>
-        </w:rPr>
-        <w:t>NLP  |  github.com/josephine-amponsah/factchecking-llm-responses  |  Mar 2026</w:t>
-      </w:r>
-    </w:p>
-    <w:p>
-      <w:pPr>
-        <w:pStyle w:val="ListBullet"/>
-        <w:spacing w:before="20" w:after="20"/>
-        <w:ind w:left="360"/>
-      </w:pPr>
-      <w:r>
-        <w:rPr>
-          <w:rFonts w:ascii="Calibri" w:hAnsi="Calibri"/>
-          <w:b w:val="0"/>
-          <w:i w:val="0"/>
-          <w:sz w:val="21"/>
-        </w:rPr>
-        <w:t>Developed a fact-checking pipeline to assess and validate LLM-generated responses against grounding sources</w:t>
-      </w:r>
-    </w:p>
-    <w:p>
-      <w:pPr>
-        <w:pStyle w:val="ListBullet"/>
-        <w:spacing w:before="20" w:after="20"/>
-        <w:ind w:left="360"/>
-      </w:pPr>
-      <w:r>
-        <w:rPr>
-          <w:rFonts w:ascii="Calibri" w:hAnsi="Calibri"/>
-          <w:b w:val="0"/>
-          <w:i w:val="0"/>
-          <w:sz w:val="21"/>
-        </w:rPr>
-        <w:t>Relevant to financial document verification and validation use cases (e.g., FinBERT-style applications)</w:t>
-      </w:r>
-    </w:p>
-    <w:p>
-      <w:pPr>
-        <w:spacing w:before="100" w:after="20"/>
-      </w:pPr>
-      <w:r>
-        <w:rPr>
-          <w:rFonts w:ascii="Calibri" w:hAnsi="Calibri"/>
-          <w:b/>
-          <w:i w:val="0"/>
-          <w:sz w:val="21"/>
-        </w:rPr>
-        <w:t>Aspect-Based Sentiment Analysis with BERT (Prior Project)</w:t>
-      </w:r>
-    </w:p>
-    <w:p>
-      <w:pPr>
-        <w:spacing w:before="0" w:after="20"/>
-      </w:pPr>
-      <w:r>
-        <w:rPr>
-          <w:rFonts w:ascii="Calibri" w:hAnsi="Calibri"/>
-          <w:b w:val="0"/>
-          <w:i/>
-          <w:color w:val="404040"/>
-          <w:sz w:val="20"/>
-        </w:rPr>
-        <w:t>github.com/josephine-amponsah/absa-based-recommender</w:t>
-      </w:r>
-    </w:p>
-    <w:p>
-      <w:pPr>
-        <w:pStyle w:val="ListBullet"/>
-        <w:spacing w:before="20" w:after="20"/>
-        <w:ind w:left="360"/>
-      </w:pPr>
-      <w:r>
-        <w:rPr>
-          <w:rFonts w:ascii="Calibri" w:hAnsi="Calibri"/>
-          <w:b w:val="0"/>
-          <w:i w:val="0"/>
-          <w:sz w:val="21"/>
-        </w:rPr>
-        <w:t>Built aspect-based sentiment analysis model using Word2vec and BERT-based ABSA on user review data to generate fine-grained customer sentiments on specific product aspects</w:t>
-      </w:r>
-    </w:p>
-    <w:p>
-      <w:pPr>
-        <w:pStyle w:val="ListBullet"/>
-        <w:spacing w:before="20" w:after="20"/>
-        <w:ind w:left="360"/>
-      </w:pPr>
-      <w:r>
-        <w:rPr>
-          <w:rFonts w:ascii="Calibri" w:hAnsi="Calibri"/>
-          <w:b w:val="0"/>
-          <w:i w:val="0"/>
-          <w:sz w:val="21"/>
-        </w:rPr>
-        <w:t>Integrated sentiment outputs into a recommender system pipeline</w:t>
-      </w:r>
-    </w:p>
-    <w:p>
-      <w:pPr>
-        <w:spacing w:before="200" w:after="40"/>
-        <w:pBdr>
-          <w:bottom w:val="single" w:sz="6" w:space="1" w:color="228B22"/>
-        </w:pBdr>
-      </w:pPr>
-      <w:r>
-        <w:rPr>
-          <w:rFonts w:ascii="Calibri" w:hAnsi="Calibri"/>
-          <w:b/>
-          <w:i w:val="0"/>
-          <w:color w:val="228B22"/>
-          <w:sz w:val="22"/>
-        </w:rPr>
-        <w:t>EXPERIENCE</w:t>
-      </w:r>
-    </w:p>
-    <w:p>
-      <w:pPr>
-        <w:spacing w:before="80" w:after="20"/>
-        <w:tabs>
-          <w:tab w:val="right" w:pos="9360"/>
-        </w:tabs>
-      </w:pPr>
-      <w:r>
-        <w:rPr>
-          <w:rFonts w:ascii="Calibri" w:hAnsi="Calibri"/>
-          <w:b/>
-          <w:i w:val="0"/>
-          <w:sz w:val="21"/>
-        </w:rPr>
-        <w:t>Data Analyst  —  Fido Microcredit (FinTech)</w:t>
-      </w:r>
-      <w:r>
-        <w:rPr>
-          <w:rFonts w:ascii="Calibri" w:hAnsi="Calibri"/>
-          <w:b w:val="0"/>
-          <w:i/>
-          <w:color w:val="404040"/>
-          <w:sz w:val="21"/>
-        </w:rPr>
-        <w:tab/>
-        <w:t>July 2024 – Present</w:t>
-      </w:r>
-    </w:p>
-    <w:p>
-      <w:pPr>
-        <w:spacing w:before="40" w:after="20"/>
-      </w:pPr>
-      <w:r>
-        <w:rPr>
-          <w:rFonts w:ascii="Calibri" w:hAnsi="Calibri"/>
-          <w:b w:val="0"/>
-          <w:i/>
-          <w:color w:val="404040"/>
-          <w:sz w:val="21"/>
-        </w:rPr>
-        <w:t>Statistical Analysis &amp; ML Research</w:t>
-      </w:r>
-    </w:p>
-    <w:p>
-      <w:pPr>
-        <w:pStyle w:val="ListBullet"/>
-        <w:spacing w:before="20" w:after="20"/>
-        <w:ind w:left="360"/>
-      </w:pPr>
-      <w:r>
-        <w:rPr>
-          <w:rFonts w:ascii="Calibri" w:hAnsi="Calibri"/>
-          <w:b w:val="0"/>
-          <w:i w:val="0"/>
-          <w:sz w:val="21"/>
-        </w:rPr>
-        <w:t>Optimized statistical models behind fraud monitoring logics using a combination of central tendency measures and feature engineering techniques, reducing false fraud flags by 28%</w:t>
-      </w:r>
-    </w:p>
-    <w:p>
-      <w:pPr>
-        <w:pStyle w:val="ListBullet"/>
-        <w:spacing w:before="20" w:after="20"/>
-        <w:ind w:left="360"/>
-      </w:pPr>
-      <w:r>
-        <w:rPr>
-          <w:rFonts w:ascii="Calibri" w:hAnsi="Calibri"/>
-          <w:b w:val="0"/>
-          <w:i w:val="0"/>
-          <w:sz w:val="21"/>
-        </w:rPr>
-        <w:t>Built a new fraud rule supervised learning model to automate the flagging of newly discovered fraud patterns, which previously required blanket blocking of geohashes at precision level 5</w:t>
-      </w:r>
-    </w:p>
-    <w:p>
-      <w:pPr>
-        <w:pStyle w:val="ListBullet"/>
-        <w:spacing w:before="20" w:after="20"/>
-        <w:ind w:left="360"/>
-      </w:pPr>
-      <w:r>
-        <w:rPr>
-          <w:rFonts w:ascii="Calibri" w:hAnsi="Calibri"/>
-          <w:b w:val="0"/>
-          <w:i w:val="0"/>
-          <w:sz w:val="21"/>
-        </w:rPr>
-        <w:t>Collaborated with the engineering team on evaluation, validation, and deployment of new fraud rules to production</w:t>
-      </w:r>
-    </w:p>
-    <w:p>
-      <w:pPr>
-        <w:pStyle w:val="ListBullet"/>
-        <w:spacing w:before="20" w:after="20"/>
-        <w:ind w:left="360"/>
-      </w:pPr>
-      <w:r>
-        <w:rPr>
-          <w:rFonts w:ascii="Calibri" w:hAnsi="Calibri"/>
-          <w:b w:val="0"/>
-          <w:i w:val="0"/>
-          <w:sz w:val="21"/>
-        </w:rPr>
-        <w:t>Analysed the impact of new KYC requirements and flows on risk performance by measuring defaults across A/B testing cohorts, optimising the intended impact of new feature implementations</w:t>
-      </w:r>
-    </w:p>
-    <w:p>
-      <w:pPr>
-        <w:pStyle w:val="ListBullet"/>
-        <w:spacing w:before="20" w:after="20"/>
-        <w:ind w:left="360"/>
-      </w:pPr>
-      <w:r>
-        <w:rPr>
-          <w:rFonts w:ascii="Calibri" w:hAnsi="Calibri"/>
-          <w:b w:val="0"/>
-          <w:i w:val="0"/>
-          <w:sz w:val="21"/>
-        </w:rPr>
-        <w:t>Researched and segmented users based on loan racing behaviour and quantified risk exposure from this cohort, contributing to features implemented in new versions of risk behavioural models</w:t>
-      </w:r>
-    </w:p>
-    <w:p>
-      <w:pPr>
-        <w:spacing w:before="80" w:after="20"/>
-        <w:tabs>
-          <w:tab w:val="right" w:pos="9360"/>
-        </w:tabs>
-      </w:pPr>
-      <w:r>
-        <w:rPr>
-          <w:rFonts w:ascii="Calibri" w:hAnsi="Calibri"/>
-          <w:b/>
-          <w:i w:val="0"/>
-          <w:sz w:val="21"/>
-        </w:rPr>
-        <w:t>Data Analyst  —  WeTheBrands (E-Commerce), Germany</w:t>
-      </w:r>
-      <w:r>
-        <w:rPr>
-          <w:rFonts w:ascii="Calibri" w:hAnsi="Calibri"/>
-          <w:b w:val="0"/>
-          <w:i/>
-          <w:color w:val="404040"/>
-          <w:sz w:val="21"/>
-        </w:rPr>
-        <w:tab/>
-        <w:t>Jan 2024 – Nov 2024</w:t>
-      </w:r>
-    </w:p>
-    <w:p>
-      <w:pPr>
-        <w:spacing w:before="80" w:after="20"/>
-        <w:tabs>
-          <w:tab w:val="right" w:pos="9360"/>
-        </w:tabs>
-      </w:pPr>
-      <w:r>
-        <w:rPr>
-          <w:rFonts w:ascii="Calibri" w:hAnsi="Calibri"/>
-          <w:b/>
-          <w:i w:val="0"/>
-          <w:sz w:val="21"/>
-        </w:rPr>
-        <w:t>Data Analyst  —  Broadspectrum Digital Payments (FinTech)</w:t>
-      </w:r>
-      <w:r>
-        <w:rPr>
-          <w:rFonts w:ascii="Calibri" w:hAnsi="Calibri"/>
-          <w:b w:val="0"/>
-          <w:i/>
-          <w:color w:val="404040"/>
-          <w:sz w:val="21"/>
-        </w:rPr>
-        <w:tab/>
-        <w:t>Jan 2022 – Jan 2024</w:t>
-      </w:r>
-    </w:p>
-    <w:p>
-      <w:pPr>
-        <w:spacing w:before="200" w:after="40"/>
-        <w:pBdr>
-          <w:bottom w:val="single" w:sz="6" w:space="1" w:color="228B22"/>
-        </w:pBdr>
-      </w:pPr>
-      <w:r>
-        <w:rPr>
-          <w:rFonts w:ascii="Calibri" w:hAnsi="Calibri"/>
-          <w:b/>
-          <w:i w:val="0"/>
-          <w:color w:val="228B22"/>
-          <w:sz w:val="22"/>
-        </w:rPr>
-        <w:t>SKILLS</w:t>
-      </w:r>
-    </w:p>
-    <w:p>
-      <w:pPr>
-        <w:spacing w:before="40" w:after="40"/>
-      </w:pPr>
-      <w:r>
-        <w:rPr>
-          <w:rFonts w:ascii="Calibri" w:hAnsi="Calibri"/>
-          <w:b/>
-          <w:i w:val="0"/>
-          <w:sz w:val="21"/>
-        </w:rPr>
-        <w:t xml:space="preserve">Domains: </w:t>
-      </w:r>
-      <w:r>
-        <w:rPr>
-          <w:rFonts w:ascii="Calibri" w:hAnsi="Calibri"/>
-          <w:b w:val="0"/>
-          <w:i w:val="0"/>
-          <w:sz w:val="21"/>
-        </w:rPr>
-        <w:t>Supervised Learning, Unsupervised Learning, NLP &amp; Transformers, Deep Learning, Statistical Analysis, Forecasting, Financial Risk Modelling, Data Visualisation, Recommender Systems</w:t>
-      </w:r>
-    </w:p>
-    <w:p>
-      <w:pPr>
-        <w:spacing w:before="40" w:after="40"/>
-      </w:pPr>
-      <w:r>
-        <w:rPr>
-          <w:rFonts w:ascii="Calibri" w:hAnsi="Calibri"/>
-          <w:b/>
-          <w:i w:val="0"/>
-          <w:sz w:val="21"/>
-        </w:rPr>
-        <w:t xml:space="preserve">Frameworks/Tools: </w:t>
-      </w:r>
-      <w:r>
-        <w:rPr>
-          <w:rFonts w:ascii="Calibri" w:hAnsi="Calibri"/>
-          <w:b w:val="0"/>
-          <w:i w:val="0"/>
-          <w:sz w:val="21"/>
-        </w:rPr>
-        <w:t>PyTorch, TensorFlow/Keras, HuggingFace Transformers, Pandas, NumPy, Matplotlib, Scikit-learn, NLTK, Gensim, FastAPI, Flask, Docker, BigQuery, DBT, PowerBI, Tableau, GitHub</w:t>
-      </w:r>
-    </w:p>
-    <w:p>
-      <w:pPr>
-        <w:spacing w:before="40" w:after="40"/>
-      </w:pPr>
-      <w:r>
-        <w:rPr>
-          <w:rFonts w:ascii="Calibri" w:hAnsi="Calibri"/>
-          <w:b/>
-          <w:i w:val="0"/>
-          <w:sz w:val="21"/>
-        </w:rPr>
-        <w:t xml:space="preserve">Languages: </w:t>
-      </w:r>
-      <w:r>
-        <w:rPr>
-          <w:rFonts w:ascii="Calibri" w:hAnsi="Calibri"/>
-          <w:b w:val="0"/>
-          <w:i w:val="0"/>
-          <w:sz w:val="21"/>
-        </w:rPr>
-        <w:t>Python, R, SQL, DAX, Azure, AWS</w:t>
-      </w:r>
-    </w:p>
-    <w:p>
-      <w:pPr>
-        <w:spacing w:before="200" w:after="40"/>
-        <w:pBdr>
-          <w:bottom w:val="single" w:sz="6" w:space="1" w:color="228B22"/>
-        </w:pBdr>
-      </w:pPr>
-      <w:r>
-        <w:rPr>
-          <w:rFonts w:ascii="Calibri" w:hAnsi="Calibri"/>
-          <w:b/>
-          <w:i w:val="0"/>
-          <w:color w:val="228B22"/>
-          <w:sz w:val="22"/>
-        </w:rPr>
-        <w:t>PUBLICATIONS &amp; PRESENTATIONS</w:t>
-      </w:r>
-    </w:p>
-    <w:p>
-      <w:pPr>
-        <w:spacing w:before="40" w:after="40"/>
-      </w:pPr>
-      <w:r>
-        <w:rPr>
-          <w:rFonts w:ascii="Calibri" w:hAnsi="Calibri"/>
-          <w:b/>
-          <w:i w:val="0"/>
-          <w:sz w:val="21"/>
-        </w:rPr>
-        <w:t>Paper: "Improving Natural Language Understanding via Ensemble Debiasing and Data Cartography"</w:t>
-      </w:r>
-      <w:r>
-        <w:rPr>
-          <w:rFonts w:ascii="Calibri" w:hAnsi="Calibri"/>
-          <w:b w:val="0"/>
-          <w:i w:val="0"/>
-          <w:sz w:val="21"/>
-        </w:rPr>
-        <w:t xml:space="preserve"> — NLP Final Project Paper, University of Texas Austin, 2025. GitHub: github.com/josephine-amponsah/multi-nli-nlu-optimization</w:t>
-      </w:r>
-    </w:p>
-    <w:p>
-      <w:pPr>
-        <w:spacing w:before="40" w:after="40"/>
-      </w:pPr>
-      <w:r>
-        <w:rPr>
-          <w:rFonts w:ascii="Calibri" w:hAnsi="Calibri"/>
-          <w:b/>
-          <w:i w:val="0"/>
-          <w:sz w:val="21"/>
         </w:rPr>
         <w:t xml:space="preserve">Talk: </w:t>
       </w:r>
@@ -1104,44 +731,21 @@
           <w:rFonts w:ascii="Calibri" w:hAnsi="Calibri"/>
           <w:b w:val="0"/>
           <w:i w:val="0"/>
-          <w:sz w:val="21"/>
+          <w:sz w:val="20"/>
         </w:rPr>
-        <w:t>Statistical &amp; ML-based Fraud Risk Prediction Methods, DevX 2025 Developer Conference</w:t>
+        <w:t>Statistical &amp; ML-based Fraud Risk Prediction Methods — DevX 2025; Geospatial Segmentation for Risk Assessment — PyCon Ghana 2025.</w:t>
       </w:r>
     </w:p>
     <w:p>
       <w:pPr>
-        <w:spacing w:before="40" w:after="40"/>
+        <w:spacing w:before="20" w:after="20"/>
       </w:pPr>
       <w:r>
         <w:rPr>
           <w:rFonts w:ascii="Calibri" w:hAnsi="Calibri"/>
           <w:b/>
           <w:i w:val="0"/>
-          <w:sz w:val="21"/>
-        </w:rPr>
-        <w:t xml:space="preserve">Talk: </w:t>
-      </w:r>
-      <w:r>
-        <w:rPr>
-          <w:rFonts w:ascii="Calibri" w:hAnsi="Calibri"/>
-          <w:b w:val="0"/>
-          <w:i w:val="0"/>
-          <w:sz w:val="21"/>
-        </w:rPr>
-        <w:t>Geospatial Segmentation for Risk Assessment, PyCon Ghana 2025</w:t>
-      </w:r>
-    </w:p>
-    <w:p>
-      <w:pPr>
-        <w:spacing w:before="40" w:after="40"/>
-      </w:pPr>
-      <w:r>
-        <w:rPr>
-          <w:rFonts w:ascii="Calibri" w:hAnsi="Calibri"/>
-          <w:b/>
-          <w:i w:val="0"/>
-          <w:sz w:val="21"/>
+          <w:sz w:val="20"/>
         </w:rPr>
         <w:t xml:space="preserve">Writing: </w:t>
       </w:r>
@@ -1150,14 +754,14 @@
           <w:rFonts w:ascii="Calibri" w:hAnsi="Calibri"/>
           <w:b w:val="0"/>
           <w:i w:val="0"/>
-          <w:sz w:val="21"/>
+          <w:sz w:val="20"/>
         </w:rPr>
-        <w:t>Researching and publishing articles on practical implementations of mathematical, machine learning, and finance concepts for intermediate Data Analyst &amp; Scientist audiences</w:t>
+        <w:t>Publishing practical ML, mathematics and finance articles for intermediate data practitioners.</w:t>
       </w:r>
     </w:p>
     <w:sectPr>
       <w:pgSz w:w="12240" w:h="15840"/>
-      <w:pgMar w:top="1440" w:right="1440" w:bottom="1440" w:left="1440" w:header="720" w:footer="720" w:gutter="0"/>
+      <w:pgMar w:top="936" w:right="1080" w:bottom="936" w:left="1080" w:header="720" w:footer="720" w:gutter="0"/>
       <w:cols w:space="720"/>
       <w:docGrid w:linePitch="360"/>
     </w:sectPr>

</xml_diff>